<commit_message>
updated lab report with the questions
</commit_message>
<xml_diff>
--- a/05 - Lab - Debugging/Task 05 - Lab Report.docx
+++ b/05 - Lab - Debugging/Task 05 - Lab Report.docx
@@ -76,7 +76,189 @@
         </w:rPr>
       </w:pPr>
     </w:p>
-    <w:p/>
+    <w:p>
+      <w:r>
+        <w:t xml:space="preserve">Q.1 What is the difference between a struct and a class? </w:t>
+      </w:r>
+    </w:p>
+    <w:p>
+      <w:r>
+        <w:t xml:space="preserve">Q.2 What are function declarations? </w:t>
+      </w:r>
+    </w:p>
+    <w:p>
+      <w:r>
+        <w:t xml:space="preserve">Q.3 Why are variable names not needed here? </w:t>
+      </w:r>
+    </w:p>
+    <w:p>
+      <w:r>
+        <w:t xml:space="preserve">Q.4 Does your IDE know if this method is used? </w:t>
+      </w:r>
+    </w:p>
+    <w:p>
+      <w:r>
+        <w:t xml:space="preserve">Q.5 un-initialised values ... what this show and why? </w:t>
+      </w:r>
+    </w:p>
+    <w:p>
+      <w:r>
+        <w:t xml:space="preserve">Q.6 Did this work as expected? </w:t>
+      </w:r>
+    </w:p>
+    <w:p>
+      <w:r>
+        <w:t xml:space="preserve">Q.7 Initialisation list - do you know what are they? </w:t>
+      </w:r>
+    </w:p>
+    <w:p>
+      <w:r>
+        <w:t xml:space="preserve">Q.8 Should show age=1, x=1, y=2. Does it? </w:t>
+      </w:r>
+    </w:p>
+    <w:p>
+      <w:r>
+        <w:t xml:space="preserve">Q.9 Something odd here. What and why? </w:t>
+      </w:r>
+    </w:p>
+    <w:p>
+      <w:r>
+        <w:t xml:space="preserve">Q.10 showParticle(p1) doesn't show 5,6,7 ... Why? </w:t>
+      </w:r>
+    </w:p>
+    <w:p>
+      <w:r>
+        <w:t xml:space="preserve">Q.11 So what does -&gt; mean (in words)? </w:t>
+      </w:r>
+    </w:p>
+    <w:p>
+      <w:r>
+        <w:t xml:space="preserve">Q.12 Do we need to put ( ) around *p1_ptr? </w:t>
+      </w:r>
+    </w:p>
+    <w:p>
+      <w:r>
+        <w:t xml:space="preserve">Q.13 What is the dereferenced pointer (from the example above)? </w:t>
+      </w:r>
+    </w:p>
+    <w:p>
+      <w:r>
+        <w:t xml:space="preserve">Q.14 Is p1 stored on the heap or stack? </w:t>
+      </w:r>
+    </w:p>
+    <w:p>
+      <w:r>
+        <w:t xml:space="preserve">Q.15 What is p1_ptr pointing to now? (Has it changed?) </w:t>
+      </w:r>
+    </w:p>
+    <w:p>
+      <w:r>
+        <w:t xml:space="preserve">Q.16 Is the current value of p1_ptr good or bad? Explain </w:t>
+      </w:r>
+    </w:p>
+    <w:p>
+      <w:r>
+        <w:t xml:space="preserve">Q.17 </w:t>
+      </w:r>
+      <w:r>
+        <w:t>I</w:t>
+      </w:r>
+      <w:r>
+        <w:t xml:space="preserve">s p1 still available? Explain. </w:t>
+      </w:r>
+    </w:p>
+    <w:p>
+      <w:r>
+        <w:t xml:space="preserve">Q.19 Uncomment the next code line - will it compile? </w:t>
+      </w:r>
+    </w:p>
+    <w:p>
+      <w:r>
+        <w:t xml:space="preserve">Q.20 Does your IDE tell you of any issues? If so, how? </w:t>
+      </w:r>
+    </w:p>
+    <w:p>
+      <w:r>
+        <w:t xml:space="preserve">Q.21 MAGIC NUMBER?! What is it? Is it bad? Explain! </w:t>
+      </w:r>
+    </w:p>
+    <w:p>
+      <w:r>
+        <w:t xml:space="preserve">Q.22 Explain in your own words how the array size is calculated. </w:t>
+      </w:r>
+    </w:p>
+    <w:p>
+      <w:r>
+        <w:t xml:space="preserve">Q.23 What is the difference between this function signature and </w:t>
+      </w:r>
+    </w:p>
+    <w:p>
+      <w:r>
+        <w:t xml:space="preserve">Q.24 Uncomment the following. It gives different values to those we saw </w:t>
+      </w:r>
+      <w:r>
+        <w:t>before.</w:t>
+      </w:r>
+      <w:r>
+        <w:t xml:space="preserve"> </w:t>
+      </w:r>
+    </w:p>
+    <w:p>
+      <w:r>
+        <w:t xml:space="preserve">Q.25 Change the size argument to 10 (or similar). What happens? </w:t>
+      </w:r>
+    </w:p>
+    <w:p>
+      <w:r>
+        <w:t xml:space="preserve">Q.26 What is "hex" and what does it do? (url in your notes) </w:t>
+      </w:r>
+    </w:p>
+    <w:p>
+      <w:r>
+        <w:lastRenderedPageBreak/>
+        <w:t xml:space="preserve">Q.27 What is new and what did it do? </w:t>
+      </w:r>
+    </w:p>
+    <w:p>
+      <w:r>
+        <w:t xml:space="preserve">Q.28 What is delete and what did it do? </w:t>
+      </w:r>
+    </w:p>
+    <w:p>
+      <w:r>
+        <w:t xml:space="preserve">Q.29 What happens when we try this? Explain. </w:t>
+      </w:r>
+    </w:p>
+    <w:p>
+      <w:r>
+        <w:t xml:space="preserve">Q.30 So, what is the difference between NULL and nullptr and 0? </w:t>
+      </w:r>
+    </w:p>
+    <w:p>
+      <w:r>
+        <w:t xml:space="preserve">Q.31 What happens if you try this? (A zero address now, so ...) </w:t>
+      </w:r>
+    </w:p>
+    <w:p>
+      <w:r>
+        <w:t xml:space="preserve">Q.32 Are default pointer values in an array safe? Explain. </w:t>
+      </w:r>
+    </w:p>
+    <w:p>
+      <w:r>
+        <w:t xml:space="preserve">Q.33 We should always have "delete" to match each "new". </w:t>
+      </w:r>
+    </w:p>
+    <w:p>
+      <w:r>
+        <w:t xml:space="preserve">Q.34 Should we set pointers to nullptr? Why? </w:t>
+      </w:r>
+    </w:p>
+    <w:p>
+      <w:r>
+        <w:t>Q.35 How do you create an array with new and set the size?</w:t>
+      </w:r>
+    </w:p>
     <w:sectPr>
       <w:pgSz w:w="12240" w:h="15840"/>
       <w:pgMar w:top="1440" w:right="1440" w:bottom="1440" w:left="1440" w:header="720" w:footer="720" w:gutter="0"/>

</xml_diff>

<commit_message>
trying to get debugging working on vs code
</commit_message>
<xml_diff>
--- a/05 - Lab - Debugging/Task 05 - Lab Report.docx
+++ b/05 - Lab - Debugging/Task 05 - Lab Report.docx
@@ -4,13 +4,18 @@
   <w:body>
     <w:p>
       <w:pPr>
-        <w:rPr>
+        <w:jc w:val="center"/>
+        <w:rPr>
+          <w:b/>
+          <w:bCs/>
           <w:sz w:val="32"/>
           <w:szCs w:val="32"/>
         </w:rPr>
       </w:pPr>
       <w:r>
         <w:rPr>
+          <w:b/>
+          <w:bCs/>
           <w:sz w:val="32"/>
           <w:szCs w:val="32"/>
         </w:rPr>
@@ -19,13 +24,18 @@
     </w:p>
     <w:p>
       <w:pPr>
-        <w:rPr>
+        <w:jc w:val="center"/>
+        <w:rPr>
+          <w:b/>
+          <w:bCs/>
           <w:sz w:val="32"/>
           <w:szCs w:val="32"/>
         </w:rPr>
       </w:pPr>
       <w:r>
         <w:rPr>
+          <w:b/>
+          <w:bCs/>
           <w:sz w:val="32"/>
           <w:szCs w:val="32"/>
         </w:rPr>
@@ -33,6 +43,8 @@
       </w:r>
       <w:r>
         <w:rPr>
+          <w:b/>
+          <w:bCs/>
           <w:sz w:val="32"/>
           <w:szCs w:val="32"/>
         </w:rPr>
@@ -40,6 +52,8 @@
       </w:r>
       <w:r>
         <w:rPr>
+          <w:b/>
+          <w:bCs/>
           <w:sz w:val="32"/>
           <w:szCs w:val="32"/>
         </w:rPr>
@@ -47,6 +61,8 @@
       </w:r>
       <w:r>
         <w:rPr>
+          <w:b/>
+          <w:bCs/>
           <w:sz w:val="32"/>
           <w:szCs w:val="32"/>
         </w:rPr>
@@ -54,6 +70,8 @@
       </w:r>
       <w:r>
         <w:rPr>
+          <w:b/>
+          <w:bCs/>
           <w:sz w:val="32"/>
           <w:szCs w:val="32"/>
           <w:vertAlign w:val="superscript"/>
@@ -62,200 +80,557 @@
       </w:r>
       <w:r>
         <w:rPr>
+          <w:b/>
+          <w:bCs/>
           <w:sz w:val="32"/>
           <w:szCs w:val="32"/>
         </w:rPr>
         <w:t xml:space="preserve"> August 2023</w:t>
       </w:r>
     </w:p>
-    <w:p>
-      <w:pPr>
-        <w:rPr>
-          <w:sz w:val="32"/>
-          <w:szCs w:val="32"/>
-        </w:rPr>
-      </w:pPr>
-    </w:p>
-    <w:p>
-      <w:r>
+    <w:p/>
+    <w:p>
+      <w:pPr>
+        <w:spacing w:line="360" w:lineRule="auto"/>
+        <w:rPr>
+          <w:sz w:val="28"/>
+          <w:szCs w:val="28"/>
+        </w:rPr>
+      </w:pPr>
+      <w:r>
+        <w:rPr>
+          <w:sz w:val="28"/>
+          <w:szCs w:val="28"/>
+        </w:rPr>
         <w:t xml:space="preserve">Q.1 What is the difference between a struct and a class? </w:t>
       </w:r>
     </w:p>
     <w:p>
-      <w:r>
+      <w:pPr>
+        <w:spacing w:line="360" w:lineRule="auto"/>
+        <w:rPr>
+          <w:sz w:val="28"/>
+          <w:szCs w:val="28"/>
+        </w:rPr>
+      </w:pPr>
+      <w:r>
+        <w:rPr>
+          <w:sz w:val="28"/>
+          <w:szCs w:val="28"/>
+        </w:rPr>
         <w:t xml:space="preserve">Q.2 What are function declarations? </w:t>
       </w:r>
     </w:p>
     <w:p>
-      <w:r>
+      <w:pPr>
+        <w:spacing w:line="360" w:lineRule="auto"/>
+        <w:rPr>
+          <w:sz w:val="28"/>
+          <w:szCs w:val="28"/>
+        </w:rPr>
+      </w:pPr>
+      <w:r>
+        <w:rPr>
+          <w:sz w:val="28"/>
+          <w:szCs w:val="28"/>
+        </w:rPr>
         <w:t xml:space="preserve">Q.3 Why are variable names not needed here? </w:t>
       </w:r>
     </w:p>
     <w:p>
-      <w:r>
+      <w:pPr>
+        <w:spacing w:line="360" w:lineRule="auto"/>
+        <w:rPr>
+          <w:sz w:val="28"/>
+          <w:szCs w:val="28"/>
+        </w:rPr>
+      </w:pPr>
+      <w:r>
+        <w:rPr>
+          <w:sz w:val="28"/>
+          <w:szCs w:val="28"/>
+        </w:rPr>
         <w:t xml:space="preserve">Q.4 Does your IDE know if this method is used? </w:t>
       </w:r>
     </w:p>
     <w:p>
-      <w:r>
+      <w:pPr>
+        <w:spacing w:line="360" w:lineRule="auto"/>
+        <w:rPr>
+          <w:sz w:val="28"/>
+          <w:szCs w:val="28"/>
+        </w:rPr>
+      </w:pPr>
+      <w:r>
+        <w:rPr>
+          <w:sz w:val="28"/>
+          <w:szCs w:val="28"/>
+        </w:rPr>
         <w:t xml:space="preserve">Q.5 un-initialised values ... what this show and why? </w:t>
       </w:r>
     </w:p>
     <w:p>
-      <w:r>
+      <w:pPr>
+        <w:spacing w:line="360" w:lineRule="auto"/>
+        <w:rPr>
+          <w:sz w:val="28"/>
+          <w:szCs w:val="28"/>
+        </w:rPr>
+      </w:pPr>
+      <w:r>
+        <w:rPr>
+          <w:sz w:val="28"/>
+          <w:szCs w:val="28"/>
+        </w:rPr>
         <w:t xml:space="preserve">Q.6 Did this work as expected? </w:t>
       </w:r>
     </w:p>
     <w:p>
-      <w:r>
+      <w:pPr>
+        <w:spacing w:line="360" w:lineRule="auto"/>
+        <w:rPr>
+          <w:sz w:val="28"/>
+          <w:szCs w:val="28"/>
+        </w:rPr>
+      </w:pPr>
+      <w:r>
+        <w:rPr>
+          <w:sz w:val="28"/>
+          <w:szCs w:val="28"/>
+        </w:rPr>
         <w:t xml:space="preserve">Q.7 Initialisation list - do you know what are they? </w:t>
       </w:r>
     </w:p>
     <w:p>
-      <w:r>
+      <w:pPr>
+        <w:spacing w:line="360" w:lineRule="auto"/>
+        <w:rPr>
+          <w:sz w:val="28"/>
+          <w:szCs w:val="28"/>
+        </w:rPr>
+      </w:pPr>
+      <w:r>
+        <w:rPr>
+          <w:sz w:val="28"/>
+          <w:szCs w:val="28"/>
+        </w:rPr>
         <w:t xml:space="preserve">Q.8 Should show age=1, x=1, y=2. Does it? </w:t>
       </w:r>
     </w:p>
     <w:p>
-      <w:r>
+      <w:pPr>
+        <w:spacing w:line="360" w:lineRule="auto"/>
+        <w:rPr>
+          <w:sz w:val="28"/>
+          <w:szCs w:val="28"/>
+        </w:rPr>
+      </w:pPr>
+      <w:r>
+        <w:rPr>
+          <w:sz w:val="28"/>
+          <w:szCs w:val="28"/>
+        </w:rPr>
         <w:t xml:space="preserve">Q.9 Something odd here. What and why? </w:t>
       </w:r>
     </w:p>
     <w:p>
-      <w:r>
+      <w:pPr>
+        <w:spacing w:line="360" w:lineRule="auto"/>
+        <w:rPr>
+          <w:sz w:val="28"/>
+          <w:szCs w:val="28"/>
+        </w:rPr>
+      </w:pPr>
+      <w:r>
+        <w:rPr>
+          <w:sz w:val="28"/>
+          <w:szCs w:val="28"/>
+        </w:rPr>
         <w:t xml:space="preserve">Q.10 showParticle(p1) doesn't show 5,6,7 ... Why? </w:t>
       </w:r>
     </w:p>
     <w:p>
-      <w:r>
+      <w:pPr>
+        <w:spacing w:line="360" w:lineRule="auto"/>
+        <w:rPr>
+          <w:sz w:val="28"/>
+          <w:szCs w:val="28"/>
+        </w:rPr>
+      </w:pPr>
+      <w:r>
+        <w:rPr>
+          <w:sz w:val="28"/>
+          <w:szCs w:val="28"/>
+        </w:rPr>
         <w:t xml:space="preserve">Q.11 So what does -&gt; mean (in words)? </w:t>
       </w:r>
     </w:p>
     <w:p>
-      <w:r>
+      <w:pPr>
+        <w:spacing w:line="360" w:lineRule="auto"/>
+        <w:rPr>
+          <w:sz w:val="28"/>
+          <w:szCs w:val="28"/>
+        </w:rPr>
+      </w:pPr>
+      <w:r>
+        <w:rPr>
+          <w:sz w:val="28"/>
+          <w:szCs w:val="28"/>
+        </w:rPr>
         <w:t xml:space="preserve">Q.12 Do we need to put ( ) around *p1_ptr? </w:t>
       </w:r>
     </w:p>
     <w:p>
-      <w:r>
+      <w:pPr>
+        <w:spacing w:line="360" w:lineRule="auto"/>
+        <w:rPr>
+          <w:sz w:val="28"/>
+          <w:szCs w:val="28"/>
+        </w:rPr>
+      </w:pPr>
+      <w:r>
+        <w:rPr>
+          <w:sz w:val="28"/>
+          <w:szCs w:val="28"/>
+        </w:rPr>
         <w:t xml:space="preserve">Q.13 What is the dereferenced pointer (from the example above)? </w:t>
       </w:r>
     </w:p>
     <w:p>
-      <w:r>
+      <w:pPr>
+        <w:spacing w:line="360" w:lineRule="auto"/>
+        <w:rPr>
+          <w:sz w:val="28"/>
+          <w:szCs w:val="28"/>
+        </w:rPr>
+      </w:pPr>
+      <w:r>
+        <w:rPr>
+          <w:sz w:val="28"/>
+          <w:szCs w:val="28"/>
+        </w:rPr>
         <w:t xml:space="preserve">Q.14 Is p1 stored on the heap or stack? </w:t>
       </w:r>
     </w:p>
     <w:p>
-      <w:r>
+      <w:pPr>
+        <w:spacing w:line="360" w:lineRule="auto"/>
+        <w:rPr>
+          <w:sz w:val="28"/>
+          <w:szCs w:val="28"/>
+        </w:rPr>
+      </w:pPr>
+      <w:r>
+        <w:rPr>
+          <w:sz w:val="28"/>
+          <w:szCs w:val="28"/>
+        </w:rPr>
         <w:t xml:space="preserve">Q.15 What is p1_ptr pointing to now? (Has it changed?) </w:t>
       </w:r>
     </w:p>
     <w:p>
-      <w:r>
+      <w:pPr>
+        <w:spacing w:line="360" w:lineRule="auto"/>
+        <w:rPr>
+          <w:sz w:val="28"/>
+          <w:szCs w:val="28"/>
+        </w:rPr>
+      </w:pPr>
+      <w:r>
+        <w:rPr>
+          <w:sz w:val="28"/>
+          <w:szCs w:val="28"/>
+        </w:rPr>
         <w:t xml:space="preserve">Q.16 Is the current value of p1_ptr good or bad? Explain </w:t>
       </w:r>
     </w:p>
     <w:p>
-      <w:r>
-        <w:t xml:space="preserve">Q.17 </w:t>
-      </w:r>
-      <w:r>
-        <w:t>I</w:t>
-      </w:r>
-      <w:r>
-        <w:t xml:space="preserve">s p1 still available? Explain. </w:t>
-      </w:r>
-    </w:p>
-    <w:p>
-      <w:r>
+      <w:pPr>
+        <w:spacing w:line="360" w:lineRule="auto"/>
+        <w:rPr>
+          <w:sz w:val="28"/>
+          <w:szCs w:val="28"/>
+        </w:rPr>
+      </w:pPr>
+      <w:r>
+        <w:rPr>
+          <w:sz w:val="28"/>
+          <w:szCs w:val="28"/>
+        </w:rPr>
+        <w:t xml:space="preserve">Q.17 Is p1 still available? Explain. </w:t>
+      </w:r>
+    </w:p>
+    <w:p>
+      <w:pPr>
+        <w:spacing w:line="360" w:lineRule="auto"/>
+        <w:rPr>
+          <w:sz w:val="28"/>
+          <w:szCs w:val="28"/>
+        </w:rPr>
+      </w:pPr>
+      <w:r>
+        <w:rPr>
+          <w:sz w:val="28"/>
+          <w:szCs w:val="28"/>
+        </w:rPr>
         <w:t xml:space="preserve">Q.19 Uncomment the next code line - will it compile? </w:t>
       </w:r>
     </w:p>
     <w:p>
-      <w:r>
+      <w:pPr>
+        <w:spacing w:line="360" w:lineRule="auto"/>
+        <w:rPr>
+          <w:sz w:val="28"/>
+          <w:szCs w:val="28"/>
+        </w:rPr>
+      </w:pPr>
+      <w:r>
+        <w:rPr>
+          <w:sz w:val="28"/>
+          <w:szCs w:val="28"/>
+        </w:rPr>
+        <w:lastRenderedPageBreak/>
         <w:t xml:space="preserve">Q.20 Does your IDE tell you of any issues? If so, how? </w:t>
       </w:r>
     </w:p>
     <w:p>
-      <w:r>
+      <w:pPr>
+        <w:spacing w:line="360" w:lineRule="auto"/>
+        <w:rPr>
+          <w:sz w:val="28"/>
+          <w:szCs w:val="28"/>
+        </w:rPr>
+      </w:pPr>
+      <w:r>
+        <w:rPr>
+          <w:sz w:val="28"/>
+          <w:szCs w:val="28"/>
+        </w:rPr>
         <w:t xml:space="preserve">Q.21 MAGIC NUMBER?! What is it? Is it bad? Explain! </w:t>
       </w:r>
     </w:p>
     <w:p>
-      <w:r>
+      <w:pPr>
+        <w:spacing w:line="360" w:lineRule="auto"/>
+        <w:rPr>
+          <w:sz w:val="28"/>
+          <w:szCs w:val="28"/>
+        </w:rPr>
+      </w:pPr>
+      <w:r>
+        <w:rPr>
+          <w:sz w:val="28"/>
+          <w:szCs w:val="28"/>
+        </w:rPr>
         <w:t xml:space="preserve">Q.22 Explain in your own words how the array size is calculated. </w:t>
       </w:r>
     </w:p>
     <w:p>
-      <w:r>
+      <w:pPr>
+        <w:spacing w:line="360" w:lineRule="auto"/>
+        <w:rPr>
+          <w:sz w:val="28"/>
+          <w:szCs w:val="28"/>
+        </w:rPr>
+      </w:pPr>
+      <w:r>
+        <w:rPr>
+          <w:sz w:val="28"/>
+          <w:szCs w:val="28"/>
+        </w:rPr>
         <w:t xml:space="preserve">Q.23 What is the difference between this function signature and </w:t>
       </w:r>
     </w:p>
     <w:p>
-      <w:r>
-        <w:t xml:space="preserve">Q.24 Uncomment the following. It gives different values to those we saw </w:t>
-      </w:r>
-      <w:r>
-        <w:t>before.</w:t>
-      </w:r>
-      <w:r>
-        <w:t xml:space="preserve"> </w:t>
-      </w:r>
-    </w:p>
-    <w:p>
-      <w:r>
+      <w:pPr>
+        <w:spacing w:line="360" w:lineRule="auto"/>
+        <w:rPr>
+          <w:sz w:val="28"/>
+          <w:szCs w:val="28"/>
+        </w:rPr>
+      </w:pPr>
+      <w:r>
+        <w:rPr>
+          <w:sz w:val="28"/>
+          <w:szCs w:val="28"/>
+        </w:rPr>
+        <w:t xml:space="preserve">Q.24 Uncomment the following. It gives different values to those we saw before. </w:t>
+      </w:r>
+    </w:p>
+    <w:p>
+      <w:pPr>
+        <w:spacing w:line="360" w:lineRule="auto"/>
+        <w:rPr>
+          <w:sz w:val="28"/>
+          <w:szCs w:val="28"/>
+        </w:rPr>
+      </w:pPr>
+      <w:r>
+        <w:rPr>
+          <w:sz w:val="28"/>
+          <w:szCs w:val="28"/>
+        </w:rPr>
         <w:t xml:space="preserve">Q.25 Change the size argument to 10 (or similar). What happens? </w:t>
       </w:r>
     </w:p>
     <w:p>
-      <w:r>
+      <w:pPr>
+        <w:spacing w:line="360" w:lineRule="auto"/>
+        <w:rPr>
+          <w:sz w:val="28"/>
+          <w:szCs w:val="28"/>
+        </w:rPr>
+      </w:pPr>
+      <w:r>
+        <w:rPr>
+          <w:sz w:val="28"/>
+          <w:szCs w:val="28"/>
+        </w:rPr>
         <w:t xml:space="preserve">Q.26 What is "hex" and what does it do? (url in your notes) </w:t>
       </w:r>
     </w:p>
     <w:p>
-      <w:r>
-        <w:lastRenderedPageBreak/>
+      <w:pPr>
+        <w:spacing w:line="360" w:lineRule="auto"/>
+        <w:rPr>
+          <w:sz w:val="28"/>
+          <w:szCs w:val="28"/>
+        </w:rPr>
+      </w:pPr>
+      <w:r>
+        <w:rPr>
+          <w:sz w:val="28"/>
+          <w:szCs w:val="28"/>
+        </w:rPr>
         <w:t xml:space="preserve">Q.27 What is new and what did it do? </w:t>
       </w:r>
     </w:p>
     <w:p>
-      <w:r>
+      <w:pPr>
+        <w:spacing w:line="360" w:lineRule="auto"/>
+        <w:rPr>
+          <w:sz w:val="28"/>
+          <w:szCs w:val="28"/>
+        </w:rPr>
+      </w:pPr>
+      <w:r>
+        <w:rPr>
+          <w:sz w:val="28"/>
+          <w:szCs w:val="28"/>
+        </w:rPr>
         <w:t xml:space="preserve">Q.28 What is delete and what did it do? </w:t>
       </w:r>
     </w:p>
     <w:p>
-      <w:r>
+      <w:pPr>
+        <w:spacing w:line="360" w:lineRule="auto"/>
+        <w:rPr>
+          <w:sz w:val="28"/>
+          <w:szCs w:val="28"/>
+        </w:rPr>
+      </w:pPr>
+      <w:r>
+        <w:rPr>
+          <w:sz w:val="28"/>
+          <w:szCs w:val="28"/>
+        </w:rPr>
         <w:t xml:space="preserve">Q.29 What happens when we try this? Explain. </w:t>
       </w:r>
     </w:p>
     <w:p>
-      <w:r>
+      <w:pPr>
+        <w:spacing w:line="360" w:lineRule="auto"/>
+        <w:rPr>
+          <w:sz w:val="28"/>
+          <w:szCs w:val="28"/>
+        </w:rPr>
+      </w:pPr>
+      <w:r>
+        <w:rPr>
+          <w:sz w:val="28"/>
+          <w:szCs w:val="28"/>
+        </w:rPr>
         <w:t xml:space="preserve">Q.30 So, what is the difference between NULL and nullptr and 0? </w:t>
       </w:r>
     </w:p>
     <w:p>
-      <w:r>
+      <w:pPr>
+        <w:spacing w:line="360" w:lineRule="auto"/>
+        <w:rPr>
+          <w:sz w:val="28"/>
+          <w:szCs w:val="28"/>
+        </w:rPr>
+      </w:pPr>
+      <w:r>
+        <w:rPr>
+          <w:sz w:val="28"/>
+          <w:szCs w:val="28"/>
+        </w:rPr>
         <w:t xml:space="preserve">Q.31 What happens if you try this? (A zero address now, so ...) </w:t>
       </w:r>
     </w:p>
     <w:p>
-      <w:r>
+      <w:pPr>
+        <w:spacing w:line="360" w:lineRule="auto"/>
+        <w:rPr>
+          <w:sz w:val="28"/>
+          <w:szCs w:val="28"/>
+        </w:rPr>
+      </w:pPr>
+      <w:r>
+        <w:rPr>
+          <w:sz w:val="28"/>
+          <w:szCs w:val="28"/>
+        </w:rPr>
         <w:t xml:space="preserve">Q.32 Are default pointer values in an array safe? Explain. </w:t>
       </w:r>
     </w:p>
     <w:p>
-      <w:r>
+      <w:pPr>
+        <w:spacing w:line="360" w:lineRule="auto"/>
+        <w:rPr>
+          <w:sz w:val="28"/>
+          <w:szCs w:val="28"/>
+        </w:rPr>
+      </w:pPr>
+      <w:r>
+        <w:rPr>
+          <w:sz w:val="28"/>
+          <w:szCs w:val="28"/>
+        </w:rPr>
         <w:t xml:space="preserve">Q.33 We should always have "delete" to match each "new". </w:t>
       </w:r>
     </w:p>
     <w:p>
-      <w:r>
+      <w:pPr>
+        <w:spacing w:line="360" w:lineRule="auto"/>
+        <w:rPr>
+          <w:sz w:val="28"/>
+          <w:szCs w:val="28"/>
+        </w:rPr>
+      </w:pPr>
+      <w:r>
+        <w:rPr>
+          <w:sz w:val="28"/>
+          <w:szCs w:val="28"/>
+        </w:rPr>
         <w:t xml:space="preserve">Q.34 Should we set pointers to nullptr? Why? </w:t>
       </w:r>
     </w:p>
     <w:p>
-      <w:r>
+      <w:pPr>
+        <w:spacing w:line="360" w:lineRule="auto"/>
+        <w:rPr>
+          <w:sz w:val="28"/>
+          <w:szCs w:val="28"/>
+        </w:rPr>
+      </w:pPr>
+      <w:r>
+        <w:rPr>
+          <w:sz w:val="28"/>
+          <w:szCs w:val="28"/>
+        </w:rPr>
         <w:t>Q.35 How do you create an array with new and set the size?</w:t>
       </w:r>
     </w:p>
@@ -1022,7 +1397,7 @@
   <w:style w:type="paragraph" w:default="1" w:styleId="Normal">
     <w:name w:val="Normal"/>
     <w:qFormat/>
-    <w:rsid w:val="007829F9"/>
+    <w:rsid w:val="00A037B5"/>
     <w:rPr>
       <w:rFonts w:ascii="Abadi" w:hAnsi="Abadi"/>
       <w:sz w:val="24"/>

</xml_diff>

<commit_message>
created a new solution on visual studios and imported task 5 code
</commit_message>
<xml_diff>
--- a/05 - Lab - Debugging/Task 05 - Lab Report.docx
+++ b/05 - Lab - Debugging/Task 05 - Lab Report.docx
@@ -102,7 +102,23 @@
           <w:sz w:val="28"/>
           <w:szCs w:val="28"/>
         </w:rPr>
-        <w:t>Q.1 What is the difference between a struct and a class?</w:t>
+        <w:t xml:space="preserve">Q.1 What is the difference between a </w:t>
+      </w:r>
+      <w:proofErr w:type="gramStart"/>
+      <w:r>
+        <w:rPr>
+          <w:sz w:val="28"/>
+          <w:szCs w:val="28"/>
+        </w:rPr>
+        <w:t>struct</w:t>
+      </w:r>
+      <w:proofErr w:type="gramEnd"/>
+      <w:r>
+        <w:rPr>
+          <w:sz w:val="28"/>
+          <w:szCs w:val="28"/>
+        </w:rPr>
+        <w:t xml:space="preserve"> and a class?</w:t>
       </w:r>
     </w:p>
     <w:p>
@@ -114,7 +130,13 @@
         <w:t>The Differences</w:t>
       </w:r>
       <w:r>
-        <w:t xml:space="preserve"> between struct and a class is that in struct all members are public by default and is a commonly used data structure for grouping data together and is not very complex. Whereas, In a class, all members are private by default and classes provide encapsulation and used to define complex objects with methods that provide a controlled access to internal data.</w:t>
+        <w:t xml:space="preserve"> between struct and a class is that in struct all members are public by default and is a commonly used data structure for grouping data together and is not very complex. Whereas, </w:t>
+      </w:r>
+      <w:r>
+        <w:t>in</w:t>
+      </w:r>
+      <w:r>
+        <w:t xml:space="preserve"> a class, all members are private by default and classes provide encapsulation and used to define complex objects with methods that provide a controlled access to internal data.</w:t>
       </w:r>
     </w:p>
     <w:p>
@@ -136,6 +158,15 @@
     <w:p>
       <w:pPr>
         <w:spacing w:line="360" w:lineRule="auto"/>
+        <w:jc w:val="both"/>
+      </w:pPr>
+      <w:r>
+        <w:t>Function Declarations provide a way to pass information to the compiler about a function’s name, the parameter types and return types before the actual implementation is encountered. They are needed for compilation order to allow functions to be called before they are defined, type checking to enable the compiler to verify parameters and return types and linkage to facilitate linking of function calls.</w:t>
+      </w:r>
+    </w:p>
+    <w:p>
+      <w:pPr>
+        <w:spacing w:line="360" w:lineRule="auto"/>
         <w:rPr>
           <w:sz w:val="28"/>
           <w:szCs w:val="28"/>
@@ -152,6 +183,23 @@
     <w:p>
       <w:pPr>
         <w:spacing w:line="360" w:lineRule="auto"/>
+        <w:jc w:val="both"/>
+        <w:rPr>
+          <w:sz w:val="28"/>
+          <w:szCs w:val="28"/>
+        </w:rPr>
+      </w:pPr>
+      <w:r>
+        <w:rPr>
+          <w:sz w:val="28"/>
+          <w:szCs w:val="28"/>
+        </w:rPr>
+        <w:t>The variable names are not needed here as the function declaration only focuses on the specifying functions return type and parameter types rather than specific variables names. Adding variable names can be added for clarity and documentation to aid readability of the code however these names are optional.</w:t>
+      </w:r>
+    </w:p>
+    <w:p>
+      <w:pPr>
+        <w:spacing w:line="360" w:lineRule="auto"/>
         <w:rPr>
           <w:sz w:val="28"/>
           <w:szCs w:val="28"/>
@@ -226,6 +274,7 @@
           <w:sz w:val="28"/>
           <w:szCs w:val="28"/>
         </w:rPr>
+        <w:lastRenderedPageBreak/>
         <w:t xml:space="preserve">Q.8 Should show age=1, x=1, y=2. Does it? </w:t>
       </w:r>
     </w:p>
@@ -338,215 +387,215 @@
           <w:sz w:val="28"/>
           <w:szCs w:val="28"/>
         </w:rPr>
+        <w:t xml:space="preserve">Q.15 What is p1_ptr pointing to now? (Has it changed?) </w:t>
+      </w:r>
+    </w:p>
+    <w:p>
+      <w:pPr>
+        <w:spacing w:line="360" w:lineRule="auto"/>
+        <w:rPr>
+          <w:sz w:val="28"/>
+          <w:szCs w:val="28"/>
+        </w:rPr>
+      </w:pPr>
+      <w:r>
+        <w:rPr>
+          <w:sz w:val="28"/>
+          <w:szCs w:val="28"/>
+        </w:rPr>
+        <w:t xml:space="preserve">Q.16 Is the current value of p1_ptr good or bad? Explain </w:t>
+      </w:r>
+    </w:p>
+    <w:p>
+      <w:pPr>
+        <w:spacing w:line="360" w:lineRule="auto"/>
+        <w:rPr>
+          <w:sz w:val="28"/>
+          <w:szCs w:val="28"/>
+        </w:rPr>
+      </w:pPr>
+      <w:r>
+        <w:rPr>
+          <w:sz w:val="28"/>
+          <w:szCs w:val="28"/>
+        </w:rPr>
+        <w:t xml:space="preserve">Q.17 Is p1 still available? Explain. </w:t>
+      </w:r>
+    </w:p>
+    <w:p>
+      <w:pPr>
+        <w:spacing w:line="360" w:lineRule="auto"/>
+        <w:rPr>
+          <w:sz w:val="28"/>
+          <w:szCs w:val="28"/>
+        </w:rPr>
+      </w:pPr>
+      <w:r>
+        <w:rPr>
+          <w:sz w:val="28"/>
+          <w:szCs w:val="28"/>
+        </w:rPr>
+        <w:t xml:space="preserve">Q.19 Uncomment the next code line - will it compile? </w:t>
+      </w:r>
+    </w:p>
+    <w:p>
+      <w:pPr>
+        <w:spacing w:line="360" w:lineRule="auto"/>
+        <w:rPr>
+          <w:sz w:val="28"/>
+          <w:szCs w:val="28"/>
+        </w:rPr>
+      </w:pPr>
+      <w:r>
+        <w:rPr>
+          <w:sz w:val="28"/>
+          <w:szCs w:val="28"/>
+        </w:rPr>
+        <w:t xml:space="preserve">Q.20 Does your IDE tell you of any issues? If so, how? </w:t>
+      </w:r>
+    </w:p>
+    <w:p>
+      <w:pPr>
+        <w:spacing w:line="360" w:lineRule="auto"/>
+        <w:rPr>
+          <w:sz w:val="28"/>
+          <w:szCs w:val="28"/>
+        </w:rPr>
+      </w:pPr>
+      <w:r>
+        <w:rPr>
+          <w:sz w:val="28"/>
+          <w:szCs w:val="28"/>
+        </w:rPr>
+        <w:t xml:space="preserve">Q.21 MAGIC NUMBER?! What is it? Is it bad? Explain! </w:t>
+      </w:r>
+    </w:p>
+    <w:p>
+      <w:pPr>
+        <w:spacing w:line="360" w:lineRule="auto"/>
+        <w:rPr>
+          <w:sz w:val="28"/>
+          <w:szCs w:val="28"/>
+        </w:rPr>
+      </w:pPr>
+      <w:r>
+        <w:rPr>
+          <w:sz w:val="28"/>
+          <w:szCs w:val="28"/>
+        </w:rPr>
+        <w:t xml:space="preserve">Q.22 Explain in your own words how the array size is calculated. </w:t>
+      </w:r>
+    </w:p>
+    <w:p>
+      <w:pPr>
+        <w:spacing w:line="360" w:lineRule="auto"/>
+        <w:rPr>
+          <w:sz w:val="28"/>
+          <w:szCs w:val="28"/>
+        </w:rPr>
+      </w:pPr>
+      <w:r>
+        <w:rPr>
+          <w:sz w:val="28"/>
+          <w:szCs w:val="28"/>
+        </w:rPr>
+        <w:t xml:space="preserve">Q.23 What is the difference between this function signature and </w:t>
+      </w:r>
+    </w:p>
+    <w:p>
+      <w:pPr>
+        <w:spacing w:line="360" w:lineRule="auto"/>
+        <w:rPr>
+          <w:sz w:val="28"/>
+          <w:szCs w:val="28"/>
+        </w:rPr>
+      </w:pPr>
+      <w:r>
+        <w:rPr>
+          <w:sz w:val="28"/>
+          <w:szCs w:val="28"/>
+        </w:rPr>
+        <w:t xml:space="preserve">Q.24 Uncomment the following. It gives different values to those we saw before. </w:t>
+      </w:r>
+    </w:p>
+    <w:p>
+      <w:pPr>
+        <w:spacing w:line="360" w:lineRule="auto"/>
+        <w:rPr>
+          <w:sz w:val="28"/>
+          <w:szCs w:val="28"/>
+        </w:rPr>
+      </w:pPr>
+      <w:r>
+        <w:rPr>
+          <w:sz w:val="28"/>
+          <w:szCs w:val="28"/>
+        </w:rPr>
+        <w:t xml:space="preserve">Q.25 Change the size argument to 10 (or similar). What happens? </w:t>
+      </w:r>
+    </w:p>
+    <w:p>
+      <w:pPr>
+        <w:spacing w:line="360" w:lineRule="auto"/>
+        <w:rPr>
+          <w:sz w:val="28"/>
+          <w:szCs w:val="28"/>
+        </w:rPr>
+      </w:pPr>
+      <w:r>
+        <w:rPr>
+          <w:sz w:val="28"/>
+          <w:szCs w:val="28"/>
+        </w:rPr>
+        <w:t xml:space="preserve">Q.26 What is "hex" and what does it do? (url in your notes) </w:t>
+      </w:r>
+    </w:p>
+    <w:p>
+      <w:pPr>
+        <w:spacing w:line="360" w:lineRule="auto"/>
+        <w:rPr>
+          <w:sz w:val="28"/>
+          <w:szCs w:val="28"/>
+        </w:rPr>
+      </w:pPr>
+      <w:r>
+        <w:rPr>
+          <w:sz w:val="28"/>
+          <w:szCs w:val="28"/>
+        </w:rPr>
+        <w:t xml:space="preserve">Q.27 What is new and what did it do? </w:t>
+      </w:r>
+    </w:p>
+    <w:p>
+      <w:pPr>
+        <w:spacing w:line="360" w:lineRule="auto"/>
+        <w:rPr>
+          <w:sz w:val="28"/>
+          <w:szCs w:val="28"/>
+        </w:rPr>
+      </w:pPr>
+      <w:r>
+        <w:rPr>
+          <w:sz w:val="28"/>
+          <w:szCs w:val="28"/>
+        </w:rPr>
+        <w:t xml:space="preserve">Q.28 What is delete and what did it do? </w:t>
+      </w:r>
+    </w:p>
+    <w:p>
+      <w:pPr>
+        <w:spacing w:line="360" w:lineRule="auto"/>
+        <w:rPr>
+          <w:sz w:val="28"/>
+          <w:szCs w:val="28"/>
+        </w:rPr>
+      </w:pPr>
+      <w:r>
+        <w:rPr>
+          <w:sz w:val="28"/>
+          <w:szCs w:val="28"/>
+        </w:rPr>
         <w:lastRenderedPageBreak/>
-        <w:t xml:space="preserve">Q.15 What is p1_ptr pointing to now? (Has it changed?) </w:t>
-      </w:r>
-    </w:p>
-    <w:p>
-      <w:pPr>
-        <w:spacing w:line="360" w:lineRule="auto"/>
-        <w:rPr>
-          <w:sz w:val="28"/>
-          <w:szCs w:val="28"/>
-        </w:rPr>
-      </w:pPr>
-      <w:r>
-        <w:rPr>
-          <w:sz w:val="28"/>
-          <w:szCs w:val="28"/>
-        </w:rPr>
-        <w:t xml:space="preserve">Q.16 Is the current value of p1_ptr good or bad? Explain </w:t>
-      </w:r>
-    </w:p>
-    <w:p>
-      <w:pPr>
-        <w:spacing w:line="360" w:lineRule="auto"/>
-        <w:rPr>
-          <w:sz w:val="28"/>
-          <w:szCs w:val="28"/>
-        </w:rPr>
-      </w:pPr>
-      <w:r>
-        <w:rPr>
-          <w:sz w:val="28"/>
-          <w:szCs w:val="28"/>
-        </w:rPr>
-        <w:t xml:space="preserve">Q.17 Is p1 still available? Explain. </w:t>
-      </w:r>
-    </w:p>
-    <w:p>
-      <w:pPr>
-        <w:spacing w:line="360" w:lineRule="auto"/>
-        <w:rPr>
-          <w:sz w:val="28"/>
-          <w:szCs w:val="28"/>
-        </w:rPr>
-      </w:pPr>
-      <w:r>
-        <w:rPr>
-          <w:sz w:val="28"/>
-          <w:szCs w:val="28"/>
-        </w:rPr>
-        <w:t xml:space="preserve">Q.19 Uncomment the next code line - will it compile? </w:t>
-      </w:r>
-    </w:p>
-    <w:p>
-      <w:pPr>
-        <w:spacing w:line="360" w:lineRule="auto"/>
-        <w:rPr>
-          <w:sz w:val="28"/>
-          <w:szCs w:val="28"/>
-        </w:rPr>
-      </w:pPr>
-      <w:r>
-        <w:rPr>
-          <w:sz w:val="28"/>
-          <w:szCs w:val="28"/>
-        </w:rPr>
-        <w:t xml:space="preserve">Q.20 Does your IDE tell you of any issues? If so, how? </w:t>
-      </w:r>
-    </w:p>
-    <w:p>
-      <w:pPr>
-        <w:spacing w:line="360" w:lineRule="auto"/>
-        <w:rPr>
-          <w:sz w:val="28"/>
-          <w:szCs w:val="28"/>
-        </w:rPr>
-      </w:pPr>
-      <w:r>
-        <w:rPr>
-          <w:sz w:val="28"/>
-          <w:szCs w:val="28"/>
-        </w:rPr>
-        <w:t xml:space="preserve">Q.21 MAGIC NUMBER?! What is it? Is it bad? Explain! </w:t>
-      </w:r>
-    </w:p>
-    <w:p>
-      <w:pPr>
-        <w:spacing w:line="360" w:lineRule="auto"/>
-        <w:rPr>
-          <w:sz w:val="28"/>
-          <w:szCs w:val="28"/>
-        </w:rPr>
-      </w:pPr>
-      <w:r>
-        <w:rPr>
-          <w:sz w:val="28"/>
-          <w:szCs w:val="28"/>
-        </w:rPr>
-        <w:t xml:space="preserve">Q.22 Explain in your own words how the array size is calculated. </w:t>
-      </w:r>
-    </w:p>
-    <w:p>
-      <w:pPr>
-        <w:spacing w:line="360" w:lineRule="auto"/>
-        <w:rPr>
-          <w:sz w:val="28"/>
-          <w:szCs w:val="28"/>
-        </w:rPr>
-      </w:pPr>
-      <w:r>
-        <w:rPr>
-          <w:sz w:val="28"/>
-          <w:szCs w:val="28"/>
-        </w:rPr>
-        <w:t xml:space="preserve">Q.23 What is the difference between this function signature and </w:t>
-      </w:r>
-    </w:p>
-    <w:p>
-      <w:pPr>
-        <w:spacing w:line="360" w:lineRule="auto"/>
-        <w:rPr>
-          <w:sz w:val="28"/>
-          <w:szCs w:val="28"/>
-        </w:rPr>
-      </w:pPr>
-      <w:r>
-        <w:rPr>
-          <w:sz w:val="28"/>
-          <w:szCs w:val="28"/>
-        </w:rPr>
-        <w:t xml:space="preserve">Q.24 Uncomment the following. It gives different values to those we saw before. </w:t>
-      </w:r>
-    </w:p>
-    <w:p>
-      <w:pPr>
-        <w:spacing w:line="360" w:lineRule="auto"/>
-        <w:rPr>
-          <w:sz w:val="28"/>
-          <w:szCs w:val="28"/>
-        </w:rPr>
-      </w:pPr>
-      <w:r>
-        <w:rPr>
-          <w:sz w:val="28"/>
-          <w:szCs w:val="28"/>
-        </w:rPr>
-        <w:t xml:space="preserve">Q.25 Change the size argument to 10 (or similar). What happens? </w:t>
-      </w:r>
-    </w:p>
-    <w:p>
-      <w:pPr>
-        <w:spacing w:line="360" w:lineRule="auto"/>
-        <w:rPr>
-          <w:sz w:val="28"/>
-          <w:szCs w:val="28"/>
-        </w:rPr>
-      </w:pPr>
-      <w:r>
-        <w:rPr>
-          <w:sz w:val="28"/>
-          <w:szCs w:val="28"/>
-        </w:rPr>
-        <w:t xml:space="preserve">Q.26 What is "hex" and what does it do? (url in your notes) </w:t>
-      </w:r>
-    </w:p>
-    <w:p>
-      <w:pPr>
-        <w:spacing w:line="360" w:lineRule="auto"/>
-        <w:rPr>
-          <w:sz w:val="28"/>
-          <w:szCs w:val="28"/>
-        </w:rPr>
-      </w:pPr>
-      <w:r>
-        <w:rPr>
-          <w:sz w:val="28"/>
-          <w:szCs w:val="28"/>
-        </w:rPr>
-        <w:t xml:space="preserve">Q.27 What is new and what did it do? </w:t>
-      </w:r>
-    </w:p>
-    <w:p>
-      <w:pPr>
-        <w:spacing w:line="360" w:lineRule="auto"/>
-        <w:rPr>
-          <w:sz w:val="28"/>
-          <w:szCs w:val="28"/>
-        </w:rPr>
-      </w:pPr>
-      <w:r>
-        <w:rPr>
-          <w:sz w:val="28"/>
-          <w:szCs w:val="28"/>
-        </w:rPr>
-        <w:t xml:space="preserve">Q.28 What is delete and what did it do? </w:t>
-      </w:r>
-    </w:p>
-    <w:p>
-      <w:pPr>
-        <w:spacing w:line="360" w:lineRule="auto"/>
-        <w:rPr>
-          <w:sz w:val="28"/>
-          <w:szCs w:val="28"/>
-        </w:rPr>
-      </w:pPr>
-      <w:r>
-        <w:rPr>
-          <w:sz w:val="28"/>
-          <w:szCs w:val="28"/>
-        </w:rPr>
         <w:t xml:space="preserve">Q.29 What happens when we try this? Explain. </w:t>
       </w:r>
     </w:p>

</xml_diff>

<commit_message>
fixed errors and turn loop true inorder for debug to work
</commit_message>
<xml_diff>
--- a/05 - Lab - Debugging/Task 05 - Lab Report.docx
+++ b/05 - Lab - Debugging/Task 05 - Lab Report.docx
@@ -254,15 +254,13 @@
         <w:lastRenderedPageBreak/>
         <w:t xml:space="preserve">Q.5 un-initialised values ... what </w:t>
       </w:r>
-      <w:proofErr w:type="gramStart"/>
-      <w:r>
-        <w:rPr>
-          <w:sz w:val="28"/>
-          <w:szCs w:val="28"/>
-        </w:rPr>
-        <w:t>this</w:t>
-      </w:r>
-      <w:proofErr w:type="gramEnd"/>
+      <w:r>
+        <w:rPr>
+          <w:sz w:val="28"/>
+          <w:szCs w:val="28"/>
+        </w:rPr>
+        <w:t>does this</w:t>
+      </w:r>
       <w:r>
         <w:rPr>
           <w:sz w:val="28"/>
@@ -274,6 +272,55 @@
     <w:p>
       <w:pPr>
         <w:spacing w:line="360" w:lineRule="auto"/>
+        <w:jc w:val="both"/>
+        <w:rPr>
+          <w:sz w:val="28"/>
+          <w:szCs w:val="28"/>
+        </w:rPr>
+      </w:pPr>
+      <w:r>
+        <w:rPr>
+          <w:sz w:val="28"/>
+          <w:szCs w:val="28"/>
+        </w:rPr>
+        <w:t>So, it seems that the code is within an unreachable condition block “if (</w:t>
+      </w:r>
+      <w:proofErr w:type="spellStart"/>
+      <w:r>
+        <w:rPr>
+          <w:sz w:val="28"/>
+          <w:szCs w:val="28"/>
+        </w:rPr>
+        <w:t>flase</w:t>
+      </w:r>
+      <w:proofErr w:type="spellEnd"/>
+      <w:r>
+        <w:rPr>
+          <w:sz w:val="28"/>
+          <w:szCs w:val="28"/>
+        </w:rPr>
+        <w:t xml:space="preserve">)” so that means it would execute during runtime. </w:t>
+      </w:r>
+      <w:proofErr w:type="spellStart"/>
+      <w:r>
+        <w:rPr>
+          <w:sz w:val="28"/>
+          <w:szCs w:val="28"/>
+        </w:rPr>
+        <w:t>showParticle</w:t>
+      </w:r>
+      <w:proofErr w:type="spellEnd"/>
+      <w:r>
+        <w:rPr>
+          <w:sz w:val="28"/>
+          <w:szCs w:val="28"/>
+        </w:rPr>
+        <w:t>(a) attempts to display an uninitialized value and the IDE might warn about it as it could be an undefined behavior.</w:t>
+      </w:r>
+    </w:p>
+    <w:p>
+      <w:pPr>
+        <w:spacing w:line="360" w:lineRule="auto"/>
         <w:rPr>
           <w:sz w:val="28"/>
           <w:szCs w:val="28"/>
@@ -295,6 +342,15 @@
           <w:szCs w:val="28"/>
         </w:rPr>
       </w:pPr>
+    </w:p>
+    <w:p>
+      <w:pPr>
+        <w:spacing w:line="360" w:lineRule="auto"/>
+        <w:rPr>
+          <w:sz w:val="28"/>
+          <w:szCs w:val="28"/>
+        </w:rPr>
+      </w:pPr>
       <w:r>
         <w:rPr>
           <w:sz w:val="28"/>
@@ -524,6 +580,7 @@
           <w:sz w:val="28"/>
           <w:szCs w:val="28"/>
         </w:rPr>
+        <w:lastRenderedPageBreak/>
         <w:t xml:space="preserve">Q.22 Explain in your own words how the array size is calculated. </w:t>
       </w:r>
     </w:p>
@@ -588,7 +645,6 @@
           <w:sz w:val="28"/>
           <w:szCs w:val="28"/>
         </w:rPr>
-        <w:lastRenderedPageBreak/>
         <w:t xml:space="preserve">Q.26 What is "hex" and what does it do? (url in your notes) </w:t>
       </w:r>
     </w:p>

</xml_diff>

<commit_message>
question 25 changed size from 3 to 10
</commit_message>
<xml_diff>
--- a/05 - Lab - Debugging/Task 05 - Lab Report.docx
+++ b/05 - Lab - Debugging/Task 05 - Lab Report.docx
@@ -108,23 +108,7 @@
           <w:sz w:val="28"/>
           <w:szCs w:val="28"/>
         </w:rPr>
-        <w:t xml:space="preserve">Q.1 What is the difference between a </w:t>
-      </w:r>
-      <w:proofErr w:type="gramStart"/>
-      <w:r>
-        <w:rPr>
-          <w:sz w:val="28"/>
-          <w:szCs w:val="28"/>
-        </w:rPr>
-        <w:t>struct</w:t>
-      </w:r>
-      <w:proofErr w:type="gramEnd"/>
-      <w:r>
-        <w:rPr>
-          <w:sz w:val="28"/>
-          <w:szCs w:val="28"/>
-        </w:rPr>
-        <w:t xml:space="preserve"> and a class?</w:t>
+        <w:t>Q.1 What is the difference between a struct and a class?</w:t>
       </w:r>
     </w:p>
     <w:p>
@@ -342,21 +326,53 @@
           <w:szCs w:val="28"/>
         </w:rPr>
       </w:pPr>
-    </w:p>
-    <w:p>
-      <w:pPr>
-        <w:spacing w:line="360" w:lineRule="auto"/>
-        <w:rPr>
-          <w:sz w:val="28"/>
-          <w:szCs w:val="28"/>
-        </w:rPr>
-      </w:pPr>
-      <w:r>
-        <w:rPr>
-          <w:sz w:val="28"/>
-          <w:szCs w:val="28"/>
-        </w:rPr>
-        <w:t xml:space="preserve">Q.7 Initialisation list - do you know what are they? </w:t>
+      <w:proofErr w:type="spellStart"/>
+      <w:r>
+        <w:rPr>
+          <w:sz w:val="28"/>
+          <w:szCs w:val="28"/>
+        </w:rPr>
+        <w:t>showParticle</w:t>
+      </w:r>
+      <w:proofErr w:type="spellEnd"/>
+      <w:r>
+        <w:rPr>
+          <w:sz w:val="28"/>
+          <w:szCs w:val="28"/>
+        </w:rPr>
+        <w:t>(a) did not work as the debugger prompted an error that a is an uninitialized local variable unless it is fixed. Once fixed it works and displays that x = 10 and y = 20</w:t>
+      </w:r>
+    </w:p>
+    <w:p>
+      <w:pPr>
+        <w:spacing w:line="360" w:lineRule="auto"/>
+        <w:rPr>
+          <w:sz w:val="28"/>
+          <w:szCs w:val="28"/>
+        </w:rPr>
+      </w:pPr>
+      <w:r>
+        <w:rPr>
+          <w:sz w:val="28"/>
+          <w:szCs w:val="28"/>
+        </w:rPr>
+        <w:t>Q.7 Initialisation list - do you know what are they?</w:t>
+      </w:r>
+    </w:p>
+    <w:p>
+      <w:pPr>
+        <w:spacing w:line="360" w:lineRule="auto"/>
+        <w:rPr>
+          <w:sz w:val="28"/>
+          <w:szCs w:val="28"/>
+        </w:rPr>
+      </w:pPr>
+      <w:r>
+        <w:rPr>
+          <w:sz w:val="28"/>
+          <w:szCs w:val="28"/>
+        </w:rPr>
+        <w:t>From my understanding using a initialization list it makes it a more efficient way of initializing object members directly.</w:t>
       </w:r>
     </w:p>
     <w:p>
@@ -388,6 +404,38 @@
           <w:sz w:val="28"/>
           <w:szCs w:val="28"/>
         </w:rPr>
+        <w:t xml:space="preserve">No it does not, Instead it displays age = 1, x=2 and y=3 as we are calling </w:t>
+      </w:r>
+      <w:proofErr w:type="spellStart"/>
+      <w:r>
+        <w:rPr>
+          <w:sz w:val="28"/>
+          <w:szCs w:val="28"/>
+        </w:rPr>
+        <w:t>getParticleWith</w:t>
+      </w:r>
+      <w:proofErr w:type="spellEnd"/>
+      <w:r>
+        <w:rPr>
+          <w:sz w:val="28"/>
+          <w:szCs w:val="28"/>
+        </w:rPr>
+        <w:t>(1,2,3).</w:t>
+      </w:r>
+    </w:p>
+    <w:p>
+      <w:pPr>
+        <w:spacing w:line="360" w:lineRule="auto"/>
+        <w:rPr>
+          <w:sz w:val="28"/>
+          <w:szCs w:val="28"/>
+        </w:rPr>
+      </w:pPr>
+      <w:r>
+        <w:rPr>
+          <w:sz w:val="28"/>
+          <w:szCs w:val="28"/>
+        </w:rPr>
         <w:t xml:space="preserve">Q.9 Something odd here. What and why? </w:t>
       </w:r>
     </w:p>
@@ -404,22 +452,94 @@
           <w:sz w:val="28"/>
           <w:szCs w:val="28"/>
         </w:rPr>
-        <w:t xml:space="preserve">Q.10 showParticle(p1) doesn't show 5,6,7 ... Why? </w:t>
-      </w:r>
-    </w:p>
-    <w:p>
-      <w:pPr>
-        <w:spacing w:line="360" w:lineRule="auto"/>
-        <w:rPr>
-          <w:sz w:val="28"/>
-          <w:szCs w:val="28"/>
-        </w:rPr>
-      </w:pPr>
-      <w:r>
-        <w:rPr>
-          <w:sz w:val="28"/>
-          <w:szCs w:val="28"/>
-        </w:rPr>
+        <w:t xml:space="preserve">So we are passed values to as </w:t>
+      </w:r>
+      <w:proofErr w:type="spellStart"/>
+      <w:r>
+        <w:rPr>
+          <w:sz w:val="28"/>
+          <w:szCs w:val="28"/>
+        </w:rPr>
+        <w:t>getParticleWith</w:t>
+      </w:r>
+      <w:proofErr w:type="spellEnd"/>
+      <w:r>
+        <w:rPr>
+          <w:sz w:val="28"/>
+          <w:szCs w:val="28"/>
+        </w:rPr>
+        <w:t>(-1,2,3) where age should be -1 however in the output it’s a very large number this is due to the use of unsigned int which does not hold negative values</w:t>
+      </w:r>
+      <w:r>
+        <w:rPr>
+          <w:sz w:val="28"/>
+          <w:szCs w:val="28"/>
+        </w:rPr>
+        <w:t>.</w:t>
+      </w:r>
+    </w:p>
+    <w:p>
+      <w:pPr>
+        <w:spacing w:line="360" w:lineRule="auto"/>
+        <w:rPr>
+          <w:sz w:val="28"/>
+          <w:szCs w:val="28"/>
+        </w:rPr>
+      </w:pPr>
+      <w:r>
+        <w:rPr>
+          <w:sz w:val="28"/>
+          <w:szCs w:val="28"/>
+        </w:rPr>
+        <w:t>Q.10 showParticle(p1) doesn't show 5,6,7 ... Why?</w:t>
+      </w:r>
+    </w:p>
+    <w:p>
+      <w:pPr>
+        <w:spacing w:line="360" w:lineRule="auto"/>
+        <w:rPr>
+          <w:sz w:val="28"/>
+          <w:szCs w:val="28"/>
+        </w:rPr>
+      </w:pPr>
+      <w:r>
+        <w:rPr>
+          <w:sz w:val="28"/>
+          <w:szCs w:val="28"/>
+        </w:rPr>
+        <w:t xml:space="preserve">This is because we are passing the values via parameters rather than referencing them within </w:t>
+      </w:r>
+      <w:proofErr w:type="spellStart"/>
+      <w:r>
+        <w:rPr>
+          <w:sz w:val="28"/>
+          <w:szCs w:val="28"/>
+        </w:rPr>
+        <w:t>setParticleWith</w:t>
+      </w:r>
+      <w:proofErr w:type="spellEnd"/>
+      <w:r>
+        <w:rPr>
+          <w:sz w:val="28"/>
+          <w:szCs w:val="28"/>
+        </w:rPr>
+        <w:t xml:space="preserve"> as those values would be clones of the original variables.</w:t>
+      </w:r>
+    </w:p>
+    <w:p>
+      <w:pPr>
+        <w:spacing w:line="360" w:lineRule="auto"/>
+        <w:rPr>
+          <w:sz w:val="28"/>
+          <w:szCs w:val="28"/>
+        </w:rPr>
+      </w:pPr>
+      <w:r>
+        <w:rPr>
+          <w:sz w:val="28"/>
+          <w:szCs w:val="28"/>
+        </w:rPr>
+        <w:lastRenderedPageBreak/>
         <w:t xml:space="preserve">Q.11 So what does -&gt; mean (in words)? </w:t>
       </w:r>
     </w:p>
@@ -436,6 +556,22 @@
           <w:sz w:val="28"/>
           <w:szCs w:val="28"/>
         </w:rPr>
+        <w:t xml:space="preserve">The “-&gt;” operator is used as a pointer to access struct/class members. </w:t>
+      </w:r>
+    </w:p>
+    <w:p>
+      <w:pPr>
+        <w:spacing w:line="360" w:lineRule="auto"/>
+        <w:rPr>
+          <w:sz w:val="28"/>
+          <w:szCs w:val="28"/>
+        </w:rPr>
+      </w:pPr>
+      <w:r>
+        <w:rPr>
+          <w:sz w:val="28"/>
+          <w:szCs w:val="28"/>
+        </w:rPr>
         <w:t xml:space="preserve">Q.12 Do we need to put ( ) around *p1_ptr? </w:t>
       </w:r>
     </w:p>
@@ -452,7 +588,39 @@
           <w:sz w:val="28"/>
           <w:szCs w:val="28"/>
         </w:rPr>
-        <w:t xml:space="preserve">Q.13 What is the dereferenced pointer (from the example above)? </w:t>
+        <w:t>It is needed for clarity and to avoid operator precedence issues.</w:t>
+      </w:r>
+    </w:p>
+    <w:p>
+      <w:pPr>
+        <w:spacing w:line="360" w:lineRule="auto"/>
+        <w:rPr>
+          <w:sz w:val="28"/>
+          <w:szCs w:val="28"/>
+        </w:rPr>
+      </w:pPr>
+      <w:r>
+        <w:rPr>
+          <w:sz w:val="28"/>
+          <w:szCs w:val="28"/>
+        </w:rPr>
+        <w:t>Q.13 What is the dereferenced pointer (from the example above)?</w:t>
+      </w:r>
+    </w:p>
+    <w:p>
+      <w:pPr>
+        <w:spacing w:line="360" w:lineRule="auto"/>
+        <w:rPr>
+          <w:sz w:val="28"/>
+          <w:szCs w:val="28"/>
+        </w:rPr>
+      </w:pPr>
+      <w:r>
+        <w:rPr>
+          <w:sz w:val="28"/>
+          <w:szCs w:val="28"/>
+        </w:rPr>
+        <w:t>The dereferenced pointer could be (*p1_ptr) which gives you the object the pointer is pointing to.</w:t>
       </w:r>
     </w:p>
     <w:p>
@@ -484,6 +652,36 @@
           <w:sz w:val="28"/>
           <w:szCs w:val="28"/>
         </w:rPr>
+        <w:t>The p1 variable is stored on a stack</w:t>
+      </w:r>
+      <w:r>
+        <w:rPr>
+          <w:sz w:val="28"/>
+          <w:szCs w:val="28"/>
+        </w:rPr>
+        <w:t xml:space="preserve"> as its been created locally within a function</w:t>
+      </w:r>
+      <w:r>
+        <w:rPr>
+          <w:sz w:val="28"/>
+          <w:szCs w:val="28"/>
+        </w:rPr>
+        <w:t>.</w:t>
+      </w:r>
+    </w:p>
+    <w:p>
+      <w:pPr>
+        <w:spacing w:line="360" w:lineRule="auto"/>
+        <w:rPr>
+          <w:sz w:val="28"/>
+          <w:szCs w:val="28"/>
+        </w:rPr>
+      </w:pPr>
+      <w:r>
+        <w:rPr>
+          <w:sz w:val="28"/>
+          <w:szCs w:val="28"/>
+        </w:rPr>
         <w:t xml:space="preserve">Q.15 What is p1_ptr pointing to now? (Has it changed?) </w:t>
       </w:r>
     </w:p>
@@ -500,6 +698,22 @@
           <w:sz w:val="28"/>
           <w:szCs w:val="28"/>
         </w:rPr>
+        <w:t>The pointer still points to the same memory address. However the data stored at the memory address has changed.</w:t>
+      </w:r>
+    </w:p>
+    <w:p>
+      <w:pPr>
+        <w:spacing w:line="360" w:lineRule="auto"/>
+        <w:rPr>
+          <w:sz w:val="28"/>
+          <w:szCs w:val="28"/>
+        </w:rPr>
+      </w:pPr>
+      <w:r>
+        <w:rPr>
+          <w:sz w:val="28"/>
+          <w:szCs w:val="28"/>
+        </w:rPr>
         <w:t xml:space="preserve">Q.16 Is the current value of p1_ptr good or bad? Explain </w:t>
       </w:r>
     </w:p>
@@ -516,6 +730,22 @@
           <w:sz w:val="28"/>
           <w:szCs w:val="28"/>
         </w:rPr>
+        <w:t>The current value of p1_ptr seems good so far as p1 has not gone out of scope.</w:t>
+      </w:r>
+    </w:p>
+    <w:p>
+      <w:pPr>
+        <w:spacing w:line="360" w:lineRule="auto"/>
+        <w:rPr>
+          <w:sz w:val="28"/>
+          <w:szCs w:val="28"/>
+        </w:rPr>
+      </w:pPr>
+      <w:r>
+        <w:rPr>
+          <w:sz w:val="28"/>
+          <w:szCs w:val="28"/>
+        </w:rPr>
         <w:t xml:space="preserve">Q.17 Is p1 still available? Explain. </w:t>
       </w:r>
     </w:p>
@@ -532,6 +762,29 @@
           <w:sz w:val="28"/>
           <w:szCs w:val="28"/>
         </w:rPr>
+        <w:t>Yes,</w:t>
+      </w:r>
+      <w:r>
+        <w:rPr>
+          <w:sz w:val="28"/>
+          <w:szCs w:val="28"/>
+        </w:rPr>
+        <w:t xml:space="preserve"> p1 is still available as long as it’s within the scope.</w:t>
+      </w:r>
+    </w:p>
+    <w:p>
+      <w:pPr>
+        <w:spacing w:line="360" w:lineRule="auto"/>
+        <w:rPr>
+          <w:sz w:val="28"/>
+          <w:szCs w:val="28"/>
+        </w:rPr>
+      </w:pPr>
+      <w:r>
+        <w:rPr>
+          <w:sz w:val="28"/>
+          <w:szCs w:val="28"/>
+        </w:rPr>
         <w:t xml:space="preserve">Q.19 Uncomment the next code line - will it compile? </w:t>
       </w:r>
     </w:p>
@@ -548,6 +801,30 @@
           <w:sz w:val="28"/>
           <w:szCs w:val="28"/>
         </w:rPr>
+        <w:t>It does not as it prompts that the buffer on p_array1 of size 36 bytes will be overrun</w:t>
+      </w:r>
+      <w:r>
+        <w:rPr>
+          <w:sz w:val="28"/>
+          <w:szCs w:val="28"/>
+        </w:rPr>
+        <w:t xml:space="preserve"> and 12 bytes will be written starting at offset 36 as its out of bounds from its memory allocation.</w:t>
+      </w:r>
+    </w:p>
+    <w:p>
+      <w:pPr>
+        <w:spacing w:line="360" w:lineRule="auto"/>
+        <w:rPr>
+          <w:sz w:val="28"/>
+          <w:szCs w:val="28"/>
+        </w:rPr>
+      </w:pPr>
+      <w:r>
+        <w:rPr>
+          <w:sz w:val="28"/>
+          <w:szCs w:val="28"/>
+        </w:rPr>
+        <w:lastRenderedPageBreak/>
         <w:t xml:space="preserve">Q.20 Does your IDE tell you of any issues? If so, how? </w:t>
       </w:r>
     </w:p>
@@ -564,6 +841,22 @@
           <w:sz w:val="28"/>
           <w:szCs w:val="28"/>
         </w:rPr>
+        <w:t>Yes the line is underlined and when hovering over the error mentions the above error.</w:t>
+      </w:r>
+    </w:p>
+    <w:p>
+      <w:pPr>
+        <w:spacing w:line="360" w:lineRule="auto"/>
+        <w:rPr>
+          <w:sz w:val="28"/>
+          <w:szCs w:val="28"/>
+        </w:rPr>
+      </w:pPr>
+      <w:r>
+        <w:rPr>
+          <w:sz w:val="28"/>
+          <w:szCs w:val="28"/>
+        </w:rPr>
         <w:t xml:space="preserve">Q.21 MAGIC NUMBER?! What is it? Is it bad? Explain! </w:t>
       </w:r>
     </w:p>
@@ -580,199 +873,291 @@
           <w:sz w:val="28"/>
           <w:szCs w:val="28"/>
         </w:rPr>
+        <w:t>The MAGIC NUMBER is a raw number in the code that  and is not ideal as its not great practice.</w:t>
+      </w:r>
+    </w:p>
+    <w:p>
+      <w:pPr>
+        <w:spacing w:line="360" w:lineRule="auto"/>
+        <w:rPr>
+          <w:sz w:val="28"/>
+          <w:szCs w:val="28"/>
+        </w:rPr>
+      </w:pPr>
+      <w:r>
+        <w:rPr>
+          <w:sz w:val="28"/>
+          <w:szCs w:val="28"/>
+        </w:rPr>
+        <w:t xml:space="preserve">Q.22 Explain in your own words how the array size is calculated. </w:t>
+      </w:r>
+    </w:p>
+    <w:p>
+      <w:pPr>
+        <w:spacing w:line="360" w:lineRule="auto"/>
+        <w:rPr>
+          <w:sz w:val="28"/>
+          <w:szCs w:val="28"/>
+        </w:rPr>
+      </w:pPr>
+      <w:r>
+        <w:rPr>
+          <w:sz w:val="28"/>
+          <w:szCs w:val="28"/>
+        </w:rPr>
+        <w:t xml:space="preserve">The array size is calculated by taking the total size in bytes of the array in </w:t>
+      </w:r>
+      <w:proofErr w:type="spellStart"/>
+      <w:r>
+        <w:rPr>
+          <w:sz w:val="28"/>
+          <w:szCs w:val="28"/>
+        </w:rPr>
+        <w:t>sizeof</w:t>
+      </w:r>
+      <w:proofErr w:type="spellEnd"/>
+      <w:r>
+        <w:rPr>
+          <w:sz w:val="28"/>
+          <w:szCs w:val="28"/>
+        </w:rPr>
+        <w:t xml:space="preserve">(p_array1) </w:t>
+      </w:r>
+      <w:r>
+        <w:rPr>
+          <w:sz w:val="28"/>
+          <w:szCs w:val="28"/>
+        </w:rPr>
+        <w:t xml:space="preserve">call </w:t>
+      </w:r>
+      <w:r>
+        <w:rPr>
+          <w:sz w:val="28"/>
+          <w:szCs w:val="28"/>
+        </w:rPr>
+        <w:t xml:space="preserve">function and dividing it by the size in bytes of a single element in the </w:t>
+      </w:r>
+      <w:proofErr w:type="spellStart"/>
+      <w:r>
+        <w:rPr>
+          <w:sz w:val="28"/>
+          <w:szCs w:val="28"/>
+        </w:rPr>
+        <w:t>sizeof</w:t>
+      </w:r>
+      <w:proofErr w:type="spellEnd"/>
+      <w:r>
+        <w:rPr>
+          <w:sz w:val="28"/>
+          <w:szCs w:val="28"/>
+        </w:rPr>
+        <w:t xml:space="preserve">(p)array1[0]) </w:t>
+      </w:r>
+      <w:r>
+        <w:rPr>
+          <w:sz w:val="28"/>
+          <w:szCs w:val="28"/>
+        </w:rPr>
+        <w:t xml:space="preserve">call </w:t>
+      </w:r>
+      <w:r>
+        <w:rPr>
+          <w:sz w:val="28"/>
+          <w:szCs w:val="28"/>
+        </w:rPr>
+        <w:t>function.</w:t>
+      </w:r>
+    </w:p>
+    <w:p>
+      <w:pPr>
+        <w:spacing w:line="360" w:lineRule="auto"/>
+        <w:rPr>
+          <w:sz w:val="28"/>
+          <w:szCs w:val="28"/>
+        </w:rPr>
+      </w:pPr>
+      <w:r>
+        <w:rPr>
+          <w:sz w:val="28"/>
+          <w:szCs w:val="28"/>
+        </w:rPr>
+        <w:t xml:space="preserve">Q.23 What is the difference between this function signature and </w:t>
+      </w:r>
+    </w:p>
+    <w:p>
+      <w:pPr>
+        <w:spacing w:line="360" w:lineRule="auto"/>
+        <w:rPr>
+          <w:sz w:val="28"/>
+          <w:szCs w:val="28"/>
+        </w:rPr>
+      </w:pPr>
+      <w:r>
+        <w:rPr>
+          <w:sz w:val="28"/>
+          <w:szCs w:val="28"/>
+        </w:rPr>
+        <w:t xml:space="preserve">Q.24 Uncomment the following. It gives different values to those we saw before. </w:t>
+      </w:r>
+    </w:p>
+    <w:p>
+      <w:pPr>
+        <w:spacing w:line="360" w:lineRule="auto"/>
+        <w:rPr>
+          <w:sz w:val="28"/>
+          <w:szCs w:val="28"/>
+        </w:rPr>
+      </w:pPr>
+      <w:r>
+        <w:rPr>
+          <w:sz w:val="28"/>
+          <w:szCs w:val="28"/>
+        </w:rPr>
+        <w:t xml:space="preserve">Q.25 Change the size argument to 10 (or similar). What happens? </w:t>
+      </w:r>
+    </w:p>
+    <w:p>
+      <w:pPr>
+        <w:spacing w:line="360" w:lineRule="auto"/>
+        <w:rPr>
+          <w:sz w:val="28"/>
+          <w:szCs w:val="28"/>
+        </w:rPr>
+      </w:pPr>
+      <w:r>
+        <w:rPr>
+          <w:sz w:val="28"/>
+          <w:szCs w:val="28"/>
+        </w:rPr>
+        <w:t xml:space="preserve">Q.26 What is "hex" and what does it do? (url in your notes) </w:t>
+      </w:r>
+    </w:p>
+    <w:p>
+      <w:pPr>
+        <w:spacing w:line="360" w:lineRule="auto"/>
+        <w:rPr>
+          <w:sz w:val="28"/>
+          <w:szCs w:val="28"/>
+        </w:rPr>
+      </w:pPr>
+      <w:r>
+        <w:rPr>
+          <w:sz w:val="28"/>
+          <w:szCs w:val="28"/>
+        </w:rPr>
+        <w:t xml:space="preserve">Q.27 What is new and what did it do? </w:t>
+      </w:r>
+    </w:p>
+    <w:p>
+      <w:pPr>
+        <w:spacing w:line="360" w:lineRule="auto"/>
+        <w:rPr>
+          <w:sz w:val="28"/>
+          <w:szCs w:val="28"/>
+        </w:rPr>
+      </w:pPr>
+      <w:r>
+        <w:rPr>
+          <w:sz w:val="28"/>
+          <w:szCs w:val="28"/>
+        </w:rPr>
+        <w:t xml:space="preserve">Q.28 What is delete and what did it do? </w:t>
+      </w:r>
+    </w:p>
+    <w:p>
+      <w:pPr>
+        <w:spacing w:line="360" w:lineRule="auto"/>
+        <w:rPr>
+          <w:sz w:val="28"/>
+          <w:szCs w:val="28"/>
+        </w:rPr>
+      </w:pPr>
+      <w:r>
+        <w:rPr>
+          <w:sz w:val="28"/>
+          <w:szCs w:val="28"/>
+        </w:rPr>
+        <w:t xml:space="preserve">Q.29 What happens when we try this? Explain. </w:t>
+      </w:r>
+    </w:p>
+    <w:p>
+      <w:pPr>
+        <w:spacing w:line="360" w:lineRule="auto"/>
+        <w:rPr>
+          <w:sz w:val="28"/>
+          <w:szCs w:val="28"/>
+        </w:rPr>
+      </w:pPr>
+      <w:r>
+        <w:rPr>
+          <w:sz w:val="28"/>
+          <w:szCs w:val="28"/>
+        </w:rPr>
+        <w:t xml:space="preserve">Q.30 So, what is the difference between NULL and nullptr and 0? </w:t>
+      </w:r>
+    </w:p>
+    <w:p>
+      <w:pPr>
+        <w:spacing w:line="360" w:lineRule="auto"/>
+        <w:rPr>
+          <w:sz w:val="28"/>
+          <w:szCs w:val="28"/>
+        </w:rPr>
+      </w:pPr>
+      <w:r>
+        <w:rPr>
+          <w:sz w:val="28"/>
+          <w:szCs w:val="28"/>
+        </w:rPr>
+        <w:t xml:space="preserve">Q.31 What happens if you try this? (A zero address now, so ...) </w:t>
+      </w:r>
+    </w:p>
+    <w:p>
+      <w:pPr>
+        <w:spacing w:line="360" w:lineRule="auto"/>
+        <w:rPr>
+          <w:sz w:val="28"/>
+          <w:szCs w:val="28"/>
+        </w:rPr>
+      </w:pPr>
+      <w:r>
+        <w:rPr>
+          <w:sz w:val="28"/>
+          <w:szCs w:val="28"/>
+        </w:rPr>
+        <w:t xml:space="preserve">Q.32 Are default pointer values in an array safe? Explain. </w:t>
+      </w:r>
+    </w:p>
+    <w:p>
+      <w:pPr>
+        <w:spacing w:line="360" w:lineRule="auto"/>
+        <w:rPr>
+          <w:sz w:val="28"/>
+          <w:szCs w:val="28"/>
+        </w:rPr>
+      </w:pPr>
+      <w:r>
+        <w:rPr>
+          <w:sz w:val="28"/>
+          <w:szCs w:val="28"/>
+        </w:rPr>
+        <w:t xml:space="preserve">Q.33 We should always have "delete" to match each "new". </w:t>
+      </w:r>
+    </w:p>
+    <w:p>
+      <w:pPr>
+        <w:spacing w:line="360" w:lineRule="auto"/>
+        <w:rPr>
+          <w:sz w:val="28"/>
+          <w:szCs w:val="28"/>
+        </w:rPr>
+      </w:pPr>
+      <w:r>
+        <w:rPr>
+          <w:sz w:val="28"/>
+          <w:szCs w:val="28"/>
+        </w:rPr>
         <w:lastRenderedPageBreak/>
-        <w:t xml:space="preserve">Q.22 Explain in your own words how the array size is calculated. </w:t>
-      </w:r>
-    </w:p>
-    <w:p>
-      <w:pPr>
-        <w:spacing w:line="360" w:lineRule="auto"/>
-        <w:rPr>
-          <w:sz w:val="28"/>
-          <w:szCs w:val="28"/>
-        </w:rPr>
-      </w:pPr>
-      <w:r>
-        <w:rPr>
-          <w:sz w:val="28"/>
-          <w:szCs w:val="28"/>
-        </w:rPr>
-        <w:t xml:space="preserve">Q.23 What is the difference between this function signature and </w:t>
-      </w:r>
-    </w:p>
-    <w:p>
-      <w:pPr>
-        <w:spacing w:line="360" w:lineRule="auto"/>
-        <w:rPr>
-          <w:sz w:val="28"/>
-          <w:szCs w:val="28"/>
-        </w:rPr>
-      </w:pPr>
-      <w:r>
-        <w:rPr>
-          <w:sz w:val="28"/>
-          <w:szCs w:val="28"/>
-        </w:rPr>
-        <w:t xml:space="preserve">Q.24 Uncomment the following. It gives different values to those we saw before. </w:t>
-      </w:r>
-    </w:p>
-    <w:p>
-      <w:pPr>
-        <w:spacing w:line="360" w:lineRule="auto"/>
-        <w:rPr>
-          <w:sz w:val="28"/>
-          <w:szCs w:val="28"/>
-        </w:rPr>
-      </w:pPr>
-      <w:r>
-        <w:rPr>
-          <w:sz w:val="28"/>
-          <w:szCs w:val="28"/>
-        </w:rPr>
-        <w:t xml:space="preserve">Q.25 Change the size argument to 10 (or similar). What happens? </w:t>
-      </w:r>
-    </w:p>
-    <w:p>
-      <w:pPr>
-        <w:spacing w:line="360" w:lineRule="auto"/>
-        <w:rPr>
-          <w:sz w:val="28"/>
-          <w:szCs w:val="28"/>
-        </w:rPr>
-      </w:pPr>
-      <w:r>
-        <w:rPr>
-          <w:sz w:val="28"/>
-          <w:szCs w:val="28"/>
-        </w:rPr>
-        <w:t xml:space="preserve">Q.26 What is "hex" and what does it do? (url in your notes) </w:t>
-      </w:r>
-    </w:p>
-    <w:p>
-      <w:pPr>
-        <w:spacing w:line="360" w:lineRule="auto"/>
-        <w:rPr>
-          <w:sz w:val="28"/>
-          <w:szCs w:val="28"/>
-        </w:rPr>
-      </w:pPr>
-      <w:r>
-        <w:rPr>
-          <w:sz w:val="28"/>
-          <w:szCs w:val="28"/>
-        </w:rPr>
-        <w:t xml:space="preserve">Q.27 What is new and what did it do? </w:t>
-      </w:r>
-    </w:p>
-    <w:p>
-      <w:pPr>
-        <w:spacing w:line="360" w:lineRule="auto"/>
-        <w:rPr>
-          <w:sz w:val="28"/>
-          <w:szCs w:val="28"/>
-        </w:rPr>
-      </w:pPr>
-      <w:r>
-        <w:rPr>
-          <w:sz w:val="28"/>
-          <w:szCs w:val="28"/>
-        </w:rPr>
-        <w:t xml:space="preserve">Q.28 What is delete and what did it do? </w:t>
-      </w:r>
-    </w:p>
-    <w:p>
-      <w:pPr>
-        <w:spacing w:line="360" w:lineRule="auto"/>
-        <w:rPr>
-          <w:sz w:val="28"/>
-          <w:szCs w:val="28"/>
-        </w:rPr>
-      </w:pPr>
-      <w:r>
-        <w:rPr>
-          <w:sz w:val="28"/>
-          <w:szCs w:val="28"/>
-        </w:rPr>
-        <w:t xml:space="preserve">Q.29 What happens when we try this? Explain. </w:t>
-      </w:r>
-    </w:p>
-    <w:p>
-      <w:pPr>
-        <w:spacing w:line="360" w:lineRule="auto"/>
-        <w:rPr>
-          <w:sz w:val="28"/>
-          <w:szCs w:val="28"/>
-        </w:rPr>
-      </w:pPr>
-      <w:r>
-        <w:rPr>
-          <w:sz w:val="28"/>
-          <w:szCs w:val="28"/>
-        </w:rPr>
-        <w:t xml:space="preserve">Q.30 So, what is the difference between NULL and nullptr and 0? </w:t>
-      </w:r>
-    </w:p>
-    <w:p>
-      <w:pPr>
-        <w:spacing w:line="360" w:lineRule="auto"/>
-        <w:rPr>
-          <w:sz w:val="28"/>
-          <w:szCs w:val="28"/>
-        </w:rPr>
-      </w:pPr>
-      <w:r>
-        <w:rPr>
-          <w:sz w:val="28"/>
-          <w:szCs w:val="28"/>
-        </w:rPr>
-        <w:t xml:space="preserve">Q.31 What happens if you try this? (A zero address now, so ...) </w:t>
-      </w:r>
-    </w:p>
-    <w:p>
-      <w:pPr>
-        <w:spacing w:line="360" w:lineRule="auto"/>
-        <w:rPr>
-          <w:sz w:val="28"/>
-          <w:szCs w:val="28"/>
-        </w:rPr>
-      </w:pPr>
-      <w:r>
-        <w:rPr>
-          <w:sz w:val="28"/>
-          <w:szCs w:val="28"/>
-        </w:rPr>
-        <w:t xml:space="preserve">Q.32 Are default pointer values in an array safe? Explain. </w:t>
-      </w:r>
-    </w:p>
-    <w:p>
-      <w:pPr>
-        <w:spacing w:line="360" w:lineRule="auto"/>
-        <w:rPr>
-          <w:sz w:val="28"/>
-          <w:szCs w:val="28"/>
-        </w:rPr>
-      </w:pPr>
-      <w:r>
-        <w:rPr>
-          <w:sz w:val="28"/>
-          <w:szCs w:val="28"/>
-        </w:rPr>
-        <w:t xml:space="preserve">Q.33 We should always have "delete" to match each "new". </w:t>
-      </w:r>
-    </w:p>
-    <w:p>
-      <w:pPr>
-        <w:spacing w:line="360" w:lineRule="auto"/>
-        <w:rPr>
-          <w:sz w:val="28"/>
-          <w:szCs w:val="28"/>
-        </w:rPr>
-      </w:pPr>
-      <w:r>
-        <w:rPr>
-          <w:sz w:val="28"/>
-          <w:szCs w:val="28"/>
-        </w:rPr>
         <w:t xml:space="preserve">Q.34 Should we set pointers to nullptr? Why? </w:t>
       </w:r>
     </w:p>

</xml_diff>